<commit_message>
Added flutter create commands flags
</commit_message>
<xml_diff>
--- a/f17_flutter_CLI_&_common_issues_documentary.docx
+++ b/f17_flutter_CLI_&_common_issues_documentary.docx
@@ -227,6 +227,210 @@
       <w:pPr>
         <w:jc w:val="both"/>
         <w:rPr>
+          <w:sz w:val="32"/>
+          <w:szCs w:val="32"/>
+        </w:rPr>
+      </w:pPr>
+      <w:r>
+        <w:rPr>
+          <w:sz w:val="32"/>
+          <w:szCs w:val="32"/>
+        </w:rPr>
+        <w:t xml:space="preserve"># Use </w:t>
+      </w:r>
+      <w:r>
+        <w:rPr>
+          <w:b/>
+          <w:bCs/>
+          <w:sz w:val="32"/>
+          <w:szCs w:val="32"/>
+        </w:rPr>
+        <w:t>--org</w:t>
+      </w:r>
+      <w:r>
+        <w:rPr>
+          <w:sz w:val="32"/>
+          <w:szCs w:val="32"/>
+        </w:rPr>
+        <w:t xml:space="preserve"> flag to set the app’s package identifier (like </w:t>
+      </w:r>
+      <w:proofErr w:type="spellStart"/>
+      <w:r>
+        <w:rPr>
+          <w:b/>
+          <w:bCs/>
+          <w:sz w:val="32"/>
+          <w:szCs w:val="32"/>
+        </w:rPr>
+        <w:t>com.example</w:t>
+      </w:r>
+      <w:proofErr w:type="spellEnd"/>
+      <w:r>
+        <w:rPr>
+          <w:sz w:val="32"/>
+          <w:szCs w:val="32"/>
+        </w:rPr>
+        <w:t>)</w:t>
+      </w:r>
+    </w:p>
+    <w:p>
+      <w:pPr>
+        <w:jc w:val="both"/>
+        <w:rPr>
+          <w:b/>
+          <w:bCs/>
+          <w:color w:val="60CAF3" w:themeColor="accent4" w:themeTint="99"/>
+          <w:sz w:val="32"/>
+          <w:szCs w:val="32"/>
+        </w:rPr>
+      </w:pPr>
+      <w:r>
+        <w:rPr>
+          <w:b/>
+          <w:bCs/>
+          <w:color w:val="60CAF3" w:themeColor="accent4" w:themeTint="99"/>
+          <w:sz w:val="32"/>
+          <w:szCs w:val="32"/>
+        </w:rPr>
+        <w:t xml:space="preserve">flutter create --org </w:t>
+      </w:r>
+      <w:proofErr w:type="spellStart"/>
+      <w:r>
+        <w:rPr>
+          <w:b/>
+          <w:bCs/>
+          <w:color w:val="60CAF3" w:themeColor="accent4" w:themeTint="99"/>
+          <w:sz w:val="32"/>
+          <w:szCs w:val="32"/>
+        </w:rPr>
+        <w:t>com.nazmul.app</w:t>
+      </w:r>
+      <w:proofErr w:type="spellEnd"/>
+      <w:r>
+        <w:rPr>
+          <w:b/>
+          <w:bCs/>
+          <w:color w:val="60CAF3" w:themeColor="accent4" w:themeTint="99"/>
+          <w:sz w:val="32"/>
+          <w:szCs w:val="32"/>
+        </w:rPr>
+        <w:t xml:space="preserve"> </w:t>
+      </w:r>
+      <w:proofErr w:type="spellStart"/>
+      <w:r>
+        <w:rPr>
+          <w:b/>
+          <w:bCs/>
+          <w:color w:val="60CAF3" w:themeColor="accent4" w:themeTint="99"/>
+          <w:sz w:val="32"/>
+          <w:szCs w:val="32"/>
+        </w:rPr>
+        <w:t>my_app</w:t>
+      </w:r>
+      <w:proofErr w:type="spellEnd"/>
+    </w:p>
+    <w:p>
+      <w:pPr>
+        <w:jc w:val="both"/>
+        <w:rPr>
+          <w:sz w:val="32"/>
+          <w:szCs w:val="32"/>
+        </w:rPr>
+      </w:pPr>
+      <w:r>
+        <w:rPr>
+          <w:sz w:val="32"/>
+          <w:szCs w:val="32"/>
+        </w:rPr>
+        <w:t xml:space="preserve"># Also use </w:t>
+      </w:r>
+      <w:r>
+        <w:rPr>
+          <w:b/>
+          <w:bCs/>
+          <w:sz w:val="32"/>
+          <w:szCs w:val="32"/>
+        </w:rPr>
+        <w:t>--platforms</w:t>
+      </w:r>
+      <w:r>
+        <w:rPr>
+          <w:sz w:val="32"/>
+          <w:szCs w:val="32"/>
+        </w:rPr>
+        <w:t xml:space="preserve"> flag to specify target platforms like android, iOS, web </w:t>
+      </w:r>
+    </w:p>
+    <w:p>
+      <w:pPr>
+        <w:jc w:val="both"/>
+        <w:rPr>
+          <w:b/>
+          <w:bCs/>
+          <w:color w:val="60CAF3" w:themeColor="accent4" w:themeTint="99"/>
+          <w:sz w:val="32"/>
+          <w:szCs w:val="32"/>
+        </w:rPr>
+      </w:pPr>
+      <w:r>
+        <w:rPr>
+          <w:b/>
+          <w:bCs/>
+          <w:color w:val="60CAF3" w:themeColor="accent4" w:themeTint="99"/>
+          <w:sz w:val="32"/>
+          <w:szCs w:val="32"/>
+        </w:rPr>
+        <w:t xml:space="preserve">flutter create </w:t>
+      </w:r>
+      <w:proofErr w:type="spellStart"/>
+      <w:r>
+        <w:rPr>
+          <w:b/>
+          <w:bCs/>
+          <w:color w:val="60CAF3" w:themeColor="accent4" w:themeTint="99"/>
+          <w:sz w:val="32"/>
+          <w:szCs w:val="32"/>
+        </w:rPr>
+        <w:t>my_app</w:t>
+      </w:r>
+      <w:proofErr w:type="spellEnd"/>
+      <w:r>
+        <w:rPr>
+          <w:b/>
+          <w:bCs/>
+          <w:color w:val="60CAF3" w:themeColor="accent4" w:themeTint="99"/>
+          <w:sz w:val="32"/>
+          <w:szCs w:val="32"/>
+        </w:rPr>
+        <w:t xml:space="preserve"> --platforms android, </w:t>
+      </w:r>
+      <w:proofErr w:type="spellStart"/>
+      <w:r>
+        <w:rPr>
+          <w:b/>
+          <w:bCs/>
+          <w:color w:val="60CAF3" w:themeColor="accent4" w:themeTint="99"/>
+          <w:sz w:val="32"/>
+          <w:szCs w:val="32"/>
+        </w:rPr>
+        <w:t>ios</w:t>
+      </w:r>
+      <w:proofErr w:type="spellEnd"/>
+      <w:r>
+        <w:rPr>
+          <w:b/>
+          <w:bCs/>
+          <w:color w:val="60CAF3" w:themeColor="accent4" w:themeTint="99"/>
+          <w:sz w:val="32"/>
+          <w:szCs w:val="32"/>
+        </w:rPr>
+        <w:t>, web</w:t>
+      </w:r>
+    </w:p>
+    <w:p>
+      <w:pPr>
+        <w:jc w:val="both"/>
+        <w:rPr>
           <w:b/>
           <w:bCs/>
           <w:sz w:val="32"/>
@@ -459,6 +663,7 @@
           <w:sz w:val="32"/>
           <w:szCs w:val="32"/>
         </w:rPr>
+        <w:lastRenderedPageBreak/>
         <w:t>Running Apps:</w:t>
       </w:r>
     </w:p>
@@ -591,7 +796,6 @@
           <w:sz w:val="32"/>
           <w:szCs w:val="32"/>
         </w:rPr>
-        <w:lastRenderedPageBreak/>
         <w:t>flutter run -d windows</w:t>
       </w:r>
     </w:p>
@@ -1014,188 +1218,6 @@
           <w:sz w:val="32"/>
           <w:szCs w:val="32"/>
         </w:rPr>
-        <w:t xml:space="preserve">flutter build </w:t>
-      </w:r>
-      <w:proofErr w:type="spellStart"/>
-      <w:r>
-        <w:rPr>
-          <w:b/>
-          <w:bCs/>
-          <w:color w:val="60CAF3" w:themeColor="accent4" w:themeTint="99"/>
-          <w:sz w:val="32"/>
-          <w:szCs w:val="32"/>
-        </w:rPr>
-        <w:t>apk</w:t>
-      </w:r>
-      <w:proofErr w:type="spellEnd"/>
-    </w:p>
-    <w:p>
-      <w:pPr>
-        <w:jc w:val="both"/>
-        <w:rPr>
-          <w:sz w:val="32"/>
-          <w:szCs w:val="32"/>
-        </w:rPr>
-      </w:pPr>
-      <w:r>
-        <w:rPr>
-          <w:sz w:val="32"/>
-          <w:szCs w:val="32"/>
-        </w:rPr>
-        <w:t># Release APK</w:t>
-      </w:r>
-    </w:p>
-    <w:p>
-      <w:pPr>
-        <w:jc w:val="both"/>
-        <w:rPr>
-          <w:b/>
-          <w:bCs/>
-          <w:color w:val="60CAF3" w:themeColor="accent4" w:themeTint="99"/>
-          <w:sz w:val="32"/>
-          <w:szCs w:val="32"/>
-        </w:rPr>
-      </w:pPr>
-      <w:r>
-        <w:rPr>
-          <w:b/>
-          <w:bCs/>
-          <w:color w:val="60CAF3" w:themeColor="accent4" w:themeTint="99"/>
-          <w:sz w:val="32"/>
-          <w:szCs w:val="32"/>
-        </w:rPr>
-        <w:t xml:space="preserve">flutter build </w:t>
-      </w:r>
-      <w:proofErr w:type="spellStart"/>
-      <w:r>
-        <w:rPr>
-          <w:b/>
-          <w:bCs/>
-          <w:color w:val="60CAF3" w:themeColor="accent4" w:themeTint="99"/>
-          <w:sz w:val="32"/>
-          <w:szCs w:val="32"/>
-        </w:rPr>
-        <w:t>apk</w:t>
-      </w:r>
-      <w:proofErr w:type="spellEnd"/>
-      <w:r>
-        <w:rPr>
-          <w:b/>
-          <w:bCs/>
-          <w:color w:val="60CAF3" w:themeColor="accent4" w:themeTint="99"/>
-          <w:sz w:val="32"/>
-          <w:szCs w:val="32"/>
-        </w:rPr>
-        <w:t xml:space="preserve"> --release</w:t>
-      </w:r>
-    </w:p>
-    <w:p>
-      <w:pPr>
-        <w:jc w:val="both"/>
-        <w:rPr>
-          <w:sz w:val="32"/>
-          <w:szCs w:val="32"/>
-        </w:rPr>
-      </w:pPr>
-      <w:r>
-        <w:rPr>
-          <w:sz w:val="32"/>
-          <w:szCs w:val="32"/>
-        </w:rPr>
-        <w:t># Split APKs by ABI, generates smaller APKs.</w:t>
-      </w:r>
-    </w:p>
-    <w:p>
-      <w:pPr>
-        <w:jc w:val="both"/>
-        <w:rPr>
-          <w:b/>
-          <w:bCs/>
-          <w:color w:val="60CAF3" w:themeColor="accent4" w:themeTint="99"/>
-          <w:sz w:val="32"/>
-          <w:szCs w:val="32"/>
-        </w:rPr>
-      </w:pPr>
-      <w:r>
-        <w:rPr>
-          <w:b/>
-          <w:bCs/>
-          <w:color w:val="60CAF3" w:themeColor="accent4" w:themeTint="99"/>
-          <w:sz w:val="32"/>
-          <w:szCs w:val="32"/>
-        </w:rPr>
-        <w:t xml:space="preserve">flutter build </w:t>
-      </w:r>
-      <w:proofErr w:type="spellStart"/>
-      <w:r>
-        <w:rPr>
-          <w:b/>
-          <w:bCs/>
-          <w:color w:val="60CAF3" w:themeColor="accent4" w:themeTint="99"/>
-          <w:sz w:val="32"/>
-          <w:szCs w:val="32"/>
-        </w:rPr>
-        <w:t>apk</w:t>
-      </w:r>
-      <w:proofErr w:type="spellEnd"/>
-      <w:r>
-        <w:rPr>
-          <w:b/>
-          <w:bCs/>
-          <w:color w:val="60CAF3" w:themeColor="accent4" w:themeTint="99"/>
-          <w:sz w:val="32"/>
-          <w:szCs w:val="32"/>
-        </w:rPr>
-        <w:t xml:space="preserve"> --split-per-</w:t>
-      </w:r>
-      <w:proofErr w:type="spellStart"/>
-      <w:r>
-        <w:rPr>
-          <w:b/>
-          <w:bCs/>
-          <w:color w:val="60CAF3" w:themeColor="accent4" w:themeTint="99"/>
-          <w:sz w:val="32"/>
-          <w:szCs w:val="32"/>
-        </w:rPr>
-        <w:t>abi</w:t>
-      </w:r>
-      <w:proofErr w:type="spellEnd"/>
-    </w:p>
-    <w:p>
-      <w:pPr>
-        <w:jc w:val="both"/>
-        <w:rPr>
-          <w:sz w:val="32"/>
-          <w:szCs w:val="32"/>
-        </w:rPr>
-      </w:pPr>
-      <w:r>
-        <w:rPr>
-          <w:sz w:val="32"/>
-          <w:szCs w:val="32"/>
-        </w:rPr>
-        <w:t># Android App Bundle, used for Play Store uploads.</w:t>
-      </w:r>
-    </w:p>
-    <w:p>
-      <w:pPr>
-        <w:jc w:val="both"/>
-        <w:rPr>
-          <w:b/>
-          <w:bCs/>
-          <w:color w:val="60CAF3" w:themeColor="accent4" w:themeTint="99"/>
-          <w:sz w:val="32"/>
-          <w:szCs w:val="32"/>
-        </w:rPr>
-      </w:pPr>
-      <w:r>
-        <w:rPr>
-          <w:b/>
-          <w:bCs/>
-          <w:color w:val="60CAF3" w:themeColor="accent4" w:themeTint="99"/>
-          <w:sz w:val="32"/>
-          <w:szCs w:val="32"/>
-        </w:rPr>
         <w:lastRenderedPageBreak/>
         <w:t xml:space="preserve">flutter build </w:t>
       </w:r>
@@ -1208,6 +1230,188 @@
           <w:sz w:val="32"/>
           <w:szCs w:val="32"/>
         </w:rPr>
+        <w:t>apk</w:t>
+      </w:r>
+      <w:proofErr w:type="spellEnd"/>
+    </w:p>
+    <w:p>
+      <w:pPr>
+        <w:jc w:val="both"/>
+        <w:rPr>
+          <w:sz w:val="32"/>
+          <w:szCs w:val="32"/>
+        </w:rPr>
+      </w:pPr>
+      <w:r>
+        <w:rPr>
+          <w:sz w:val="32"/>
+          <w:szCs w:val="32"/>
+        </w:rPr>
+        <w:t># Release APK</w:t>
+      </w:r>
+    </w:p>
+    <w:p>
+      <w:pPr>
+        <w:jc w:val="both"/>
+        <w:rPr>
+          <w:b/>
+          <w:bCs/>
+          <w:color w:val="60CAF3" w:themeColor="accent4" w:themeTint="99"/>
+          <w:sz w:val="32"/>
+          <w:szCs w:val="32"/>
+        </w:rPr>
+      </w:pPr>
+      <w:r>
+        <w:rPr>
+          <w:b/>
+          <w:bCs/>
+          <w:color w:val="60CAF3" w:themeColor="accent4" w:themeTint="99"/>
+          <w:sz w:val="32"/>
+          <w:szCs w:val="32"/>
+        </w:rPr>
+        <w:t xml:space="preserve">flutter build </w:t>
+      </w:r>
+      <w:proofErr w:type="spellStart"/>
+      <w:r>
+        <w:rPr>
+          <w:b/>
+          <w:bCs/>
+          <w:color w:val="60CAF3" w:themeColor="accent4" w:themeTint="99"/>
+          <w:sz w:val="32"/>
+          <w:szCs w:val="32"/>
+        </w:rPr>
+        <w:t>apk</w:t>
+      </w:r>
+      <w:proofErr w:type="spellEnd"/>
+      <w:r>
+        <w:rPr>
+          <w:b/>
+          <w:bCs/>
+          <w:color w:val="60CAF3" w:themeColor="accent4" w:themeTint="99"/>
+          <w:sz w:val="32"/>
+          <w:szCs w:val="32"/>
+        </w:rPr>
+        <w:t xml:space="preserve"> --release</w:t>
+      </w:r>
+    </w:p>
+    <w:p>
+      <w:pPr>
+        <w:jc w:val="both"/>
+        <w:rPr>
+          <w:sz w:val="32"/>
+          <w:szCs w:val="32"/>
+        </w:rPr>
+      </w:pPr>
+      <w:r>
+        <w:rPr>
+          <w:sz w:val="32"/>
+          <w:szCs w:val="32"/>
+        </w:rPr>
+        <w:t># Split APKs by ABI, generates smaller APKs.</w:t>
+      </w:r>
+    </w:p>
+    <w:p>
+      <w:pPr>
+        <w:jc w:val="both"/>
+        <w:rPr>
+          <w:b/>
+          <w:bCs/>
+          <w:color w:val="60CAF3" w:themeColor="accent4" w:themeTint="99"/>
+          <w:sz w:val="32"/>
+          <w:szCs w:val="32"/>
+        </w:rPr>
+      </w:pPr>
+      <w:r>
+        <w:rPr>
+          <w:b/>
+          <w:bCs/>
+          <w:color w:val="60CAF3" w:themeColor="accent4" w:themeTint="99"/>
+          <w:sz w:val="32"/>
+          <w:szCs w:val="32"/>
+        </w:rPr>
+        <w:t xml:space="preserve">flutter build </w:t>
+      </w:r>
+      <w:proofErr w:type="spellStart"/>
+      <w:r>
+        <w:rPr>
+          <w:b/>
+          <w:bCs/>
+          <w:color w:val="60CAF3" w:themeColor="accent4" w:themeTint="99"/>
+          <w:sz w:val="32"/>
+          <w:szCs w:val="32"/>
+        </w:rPr>
+        <w:t>apk</w:t>
+      </w:r>
+      <w:proofErr w:type="spellEnd"/>
+      <w:r>
+        <w:rPr>
+          <w:b/>
+          <w:bCs/>
+          <w:color w:val="60CAF3" w:themeColor="accent4" w:themeTint="99"/>
+          <w:sz w:val="32"/>
+          <w:szCs w:val="32"/>
+        </w:rPr>
+        <w:t xml:space="preserve"> --split-per-</w:t>
+      </w:r>
+      <w:proofErr w:type="spellStart"/>
+      <w:r>
+        <w:rPr>
+          <w:b/>
+          <w:bCs/>
+          <w:color w:val="60CAF3" w:themeColor="accent4" w:themeTint="99"/>
+          <w:sz w:val="32"/>
+          <w:szCs w:val="32"/>
+        </w:rPr>
+        <w:t>abi</w:t>
+      </w:r>
+      <w:proofErr w:type="spellEnd"/>
+    </w:p>
+    <w:p>
+      <w:pPr>
+        <w:jc w:val="both"/>
+        <w:rPr>
+          <w:sz w:val="32"/>
+          <w:szCs w:val="32"/>
+        </w:rPr>
+      </w:pPr>
+      <w:r>
+        <w:rPr>
+          <w:sz w:val="32"/>
+          <w:szCs w:val="32"/>
+        </w:rPr>
+        <w:t># Android App Bundle, used for Play Store uploads.</w:t>
+      </w:r>
+    </w:p>
+    <w:p>
+      <w:pPr>
+        <w:jc w:val="both"/>
+        <w:rPr>
+          <w:b/>
+          <w:bCs/>
+          <w:color w:val="60CAF3" w:themeColor="accent4" w:themeTint="99"/>
+          <w:sz w:val="32"/>
+          <w:szCs w:val="32"/>
+        </w:rPr>
+      </w:pPr>
+      <w:r>
+        <w:rPr>
+          <w:b/>
+          <w:bCs/>
+          <w:color w:val="60CAF3" w:themeColor="accent4" w:themeTint="99"/>
+          <w:sz w:val="32"/>
+          <w:szCs w:val="32"/>
+        </w:rPr>
+        <w:t xml:space="preserve">flutter build </w:t>
+      </w:r>
+      <w:proofErr w:type="spellStart"/>
+      <w:r>
+        <w:rPr>
+          <w:b/>
+          <w:bCs/>
+          <w:color w:val="60CAF3" w:themeColor="accent4" w:themeTint="99"/>
+          <w:sz w:val="32"/>
+          <w:szCs w:val="32"/>
+        </w:rPr>
         <w:t>appbundle</w:t>
       </w:r>
       <w:proofErr w:type="spellEnd"/>
@@ -1521,14 +1725,7 @@
           <w:sz w:val="32"/>
           <w:szCs w:val="32"/>
         </w:rPr>
-        <w:t># Build</w:t>
-      </w:r>
-      <w:r>
-        <w:rPr>
-          <w:sz w:val="32"/>
-          <w:szCs w:val="32"/>
-        </w:rPr>
-        <w:t xml:space="preserve"> specific </w:t>
+        <w:t xml:space="preserve"># Build specific </w:t>
       </w:r>
       <w:r>
         <w:rPr>
@@ -1661,28 +1858,7 @@
           <w:sz w:val="32"/>
           <w:szCs w:val="32"/>
         </w:rPr>
-        <w:t xml:space="preserve"> flag and file path to </w:t>
-      </w:r>
-      <w:r>
-        <w:rPr>
-          <w:sz w:val="32"/>
-          <w:szCs w:val="32"/>
-        </w:rPr>
-        <w:t>build</w:t>
-      </w:r>
-      <w:r>
-        <w:rPr>
-          <w:sz w:val="32"/>
-          <w:szCs w:val="32"/>
-        </w:rPr>
-        <w:t xml:space="preserve"> that Entry-point based on Flavor</w:t>
-      </w:r>
-      <w:r>
-        <w:rPr>
-          <w:sz w:val="32"/>
-          <w:szCs w:val="32"/>
-        </w:rPr>
-        <w:t xml:space="preserve"> (Here </w:t>
+        <w:t xml:space="preserve"> flag and file path to build that Entry-point based on Flavor (Here </w:t>
       </w:r>
       <w:proofErr w:type="spellStart"/>
       <w:r>
@@ -1740,6 +1916,7 @@
           <w:sz w:val="32"/>
           <w:szCs w:val="32"/>
         </w:rPr>
+        <w:lastRenderedPageBreak/>
         <w:t xml:space="preserve">flutter build </w:t>
       </w:r>
       <w:proofErr w:type="spellStart"/>
@@ -1912,7 +2089,6 @@
           <w:sz w:val="32"/>
           <w:szCs w:val="32"/>
         </w:rPr>
-        <w:lastRenderedPageBreak/>
         <w:t xml:space="preserve">dart </w:t>
       </w:r>
       <w:proofErr w:type="gramStart"/>
@@ -2305,6 +2481,7 @@
           <w:sz w:val="32"/>
           <w:szCs w:val="32"/>
         </w:rPr>
+        <w:lastRenderedPageBreak/>
         <w:t>flutter doctor -v</w:t>
       </w:r>
     </w:p>
@@ -2440,7 +2617,6 @@
           <w:sz w:val="32"/>
           <w:szCs w:val="32"/>
         </w:rPr>
-        <w:lastRenderedPageBreak/>
         <w:t>flutter emulators</w:t>
       </w:r>
     </w:p>
@@ -2957,7 +3133,6 @@
           <w:sz w:val="32"/>
           <w:szCs w:val="32"/>
         </w:rPr>
-        <w:lastRenderedPageBreak/>
         <w:t>Asset Generation (Flutter Built-in):</w:t>
       </w:r>
     </w:p>
@@ -3391,6 +3566,7 @@
           <w:sz w:val="32"/>
           <w:szCs w:val="32"/>
         </w:rPr>
+        <w:lastRenderedPageBreak/>
         <w:t>dart run build_runner build --delete-conflicting-outputs</w:t>
       </w:r>
     </w:p>
@@ -3502,7 +3678,6 @@
           <w:sz w:val="32"/>
           <w:szCs w:val="32"/>
         </w:rPr>
-        <w:lastRenderedPageBreak/>
         <w:t>Dart SDK not found:</w:t>
       </w:r>
     </w:p>
@@ -3725,6 +3900,13 @@
           <w:szCs w:val="32"/>
         </w:rPr>
         <w:br/>
+      </w:r>
+      <w:r>
+        <w:rPr>
+          <w:sz w:val="32"/>
+          <w:szCs w:val="32"/>
+        </w:rPr>
+        <w:lastRenderedPageBreak/>
         <w:t xml:space="preserve">5. Set DNS </w:t>
       </w:r>
       <w:hyperlink r:id="rId7" w:tgtFrame="_self" w:history="1">
@@ -4191,6 +4373,7 @@
           <w:sz w:val="32"/>
           <w:szCs w:val="32"/>
         </w:rPr>
+        <w:lastRenderedPageBreak/>
         <w:t xml:space="preserve">flutter upgrade in administrator mode in </w:t>
       </w:r>
       <w:proofErr w:type="spellStart"/>
@@ -4267,13 +4450,6 @@
           <w:szCs w:val="32"/>
         </w:rPr>
         <w:br/>
-      </w:r>
-      <w:r>
-        <w:rPr>
-          <w:sz w:val="32"/>
-          <w:szCs w:val="32"/>
-        </w:rPr>
-        <w:lastRenderedPageBreak/>
         <w:t>1. First make sure your, application id. Create. an app in the firebase project with that Id. you'll find that id in the project/android/app/</w:t>
       </w:r>
       <w:proofErr w:type="spellStart"/>
@@ -4587,7 +4763,15 @@
           <w:sz w:val="32"/>
           <w:szCs w:val="32"/>
         </w:rPr>
-        <w:t xml:space="preserve"> tools and get the desired </w:t>
+        <w:t xml:space="preserve"> tools and get the </w:t>
+      </w:r>
+      <w:r>
+        <w:rPr>
+          <w:sz w:val="32"/>
+          <w:szCs w:val="32"/>
+        </w:rPr>
+        <w:lastRenderedPageBreak/>
+        <w:t xml:space="preserve">desired </w:t>
       </w:r>
       <w:proofErr w:type="spellStart"/>
       <w:r>
@@ -4683,15 +4867,7 @@
           <w:szCs w:val="32"/>
         </w:rPr>
         <w:br/>
-        <w:t xml:space="preserve">All files become read only, delete the .idea folder and restart </w:t>
-      </w:r>
-      <w:r>
-        <w:rPr>
-          <w:sz w:val="32"/>
-          <w:szCs w:val="32"/>
-        </w:rPr>
-        <w:lastRenderedPageBreak/>
-        <w:t>android studio.</w:t>
+        <w:t>All files become read only, delete the .idea folder and restart android studio.</w:t>
       </w:r>
       <w:r>
         <w:rPr>
@@ -5233,7 +5409,6 @@
           <w:sz w:val="32"/>
           <w:szCs w:val="32"/>
         </w:rPr>
-        <w:lastRenderedPageBreak/>
         <w:t xml:space="preserve">In the latitude / longitude fields, enter coordinates for our real location (e.g., </w:t>
       </w:r>
       <w:proofErr w:type="spellStart"/>
@@ -5833,6 +6008,7 @@
           <w:sz w:val="32"/>
           <w:szCs w:val="32"/>
         </w:rPr>
+        <w:lastRenderedPageBreak/>
         <w:t>&lt;/application&gt;</w:t>
       </w:r>
     </w:p>
@@ -6633,7 +6809,6 @@
           <w:sz w:val="32"/>
           <w:szCs w:val="32"/>
         </w:rPr>
-        <w:lastRenderedPageBreak/>
         <w:t xml:space="preserve">Or </w:t>
       </w:r>
       <w:r>
@@ -7102,6 +7277,7 @@
           <w:sz w:val="32"/>
           <w:szCs w:val="32"/>
         </w:rPr>
+        <w:lastRenderedPageBreak/>
         <w:t># We shouldn’t do anything for this</w:t>
       </w:r>
       <w:r>
@@ -7169,7 +7345,6 @@
           <w:sz w:val="32"/>
           <w:szCs w:val="32"/>
         </w:rPr>
-        <w:lastRenderedPageBreak/>
         <w:t xml:space="preserve">Note: Same thing goes for </w:t>
       </w:r>
       <w:r>

</xml_diff>

<commit_message>
Udpated docs 14th july 26 and learning testing
</commit_message>
<xml_diff>
--- a/f17_flutter_CLI_&_common_issues_documentary.docx
+++ b/f17_flutter_CLI_&_common_issues_documentary.docx
@@ -208,20 +208,8 @@
           <w:sz w:val="32"/>
           <w:szCs w:val="32"/>
         </w:rPr>
-        <w:t xml:space="preserve">flutter </w:t>
-      </w:r>
-      <w:proofErr w:type="gramStart"/>
-      <w:r>
-        <w:rPr>
-          <w:b/>
-          <w:bCs/>
-          <w:color w:val="60CAF3" w:themeColor="accent4" w:themeTint="99"/>
-          <w:sz w:val="32"/>
-          <w:szCs w:val="32"/>
-        </w:rPr>
-        <w:t>create .</w:t>
-      </w:r>
-      <w:proofErr w:type="gramEnd"/>
+        <w:t>flutter create .</w:t>
+      </w:r>
     </w:p>
     <w:p>
       <w:pPr>
@@ -474,7 +462,6 @@
         <w:t xml:space="preserve"># Download dependencies or packages from </w:t>
       </w:r>
       <w:proofErr w:type="spellStart"/>
-      <w:proofErr w:type="gramStart"/>
       <w:r>
         <w:rPr>
           <w:b/>
@@ -485,41 +472,28 @@
         <w:t>pubsec.yaml</w:t>
       </w:r>
       <w:proofErr w:type="spellEnd"/>
-      <w:proofErr w:type="gramEnd"/>
-    </w:p>
-    <w:p>
-      <w:pPr>
-        <w:jc w:val="both"/>
-        <w:rPr>
-          <w:b/>
-          <w:bCs/>
-          <w:color w:val="60CAF3" w:themeColor="accent4" w:themeTint="99"/>
-          <w:sz w:val="32"/>
-          <w:szCs w:val="32"/>
-        </w:rPr>
-      </w:pPr>
-      <w:r>
-        <w:rPr>
-          <w:b/>
-          <w:bCs/>
-          <w:color w:val="60CAF3" w:themeColor="accent4" w:themeTint="99"/>
-          <w:sz w:val="32"/>
-          <w:szCs w:val="32"/>
-        </w:rPr>
-        <w:t xml:space="preserve">flutter pub </w:t>
-      </w:r>
-      <w:proofErr w:type="gramStart"/>
-      <w:r>
-        <w:rPr>
-          <w:b/>
-          <w:bCs/>
-          <w:color w:val="60CAF3" w:themeColor="accent4" w:themeTint="99"/>
-          <w:sz w:val="32"/>
-          <w:szCs w:val="32"/>
-        </w:rPr>
-        <w:t>get</w:t>
-      </w:r>
-      <w:proofErr w:type="gramEnd"/>
+    </w:p>
+    <w:p>
+      <w:pPr>
+        <w:jc w:val="both"/>
+        <w:rPr>
+          <w:b/>
+          <w:bCs/>
+          <w:color w:val="60CAF3" w:themeColor="accent4" w:themeTint="99"/>
+          <w:sz w:val="32"/>
+          <w:szCs w:val="32"/>
+        </w:rPr>
+      </w:pPr>
+      <w:r>
+        <w:rPr>
+          <w:b/>
+          <w:bCs/>
+          <w:color w:val="60CAF3" w:themeColor="accent4" w:themeTint="99"/>
+          <w:sz w:val="32"/>
+          <w:szCs w:val="32"/>
+        </w:rPr>
+        <w:t>flutter pub get</w:t>
+      </w:r>
     </w:p>
     <w:p>
       <w:pPr>
@@ -702,20 +676,8 @@
           <w:sz w:val="32"/>
           <w:szCs w:val="32"/>
         </w:rPr>
-        <w:t xml:space="preserve">flutter </w:t>
-      </w:r>
-      <w:proofErr w:type="gramStart"/>
-      <w:r>
-        <w:rPr>
-          <w:b/>
-          <w:bCs/>
-          <w:color w:val="60CAF3" w:themeColor="accent4" w:themeTint="99"/>
-          <w:sz w:val="32"/>
-          <w:szCs w:val="32"/>
-        </w:rPr>
-        <w:t>run</w:t>
-      </w:r>
-      <w:proofErr w:type="gramEnd"/>
+        <w:t>flutter run</w:t>
+      </w:r>
     </w:p>
     <w:p>
       <w:pPr>
@@ -975,7 +937,6 @@
         <w:t xml:space="preserve"> </w:t>
       </w:r>
       <w:proofErr w:type="spellStart"/>
-      <w:proofErr w:type="gramStart"/>
       <w:r>
         <w:rPr>
           <w:b/>
@@ -986,7 +947,6 @@
         <w:t>main.dart</w:t>
       </w:r>
       <w:proofErr w:type="spellEnd"/>
-      <w:proofErr w:type="gramEnd"/>
       <w:r>
         <w:rPr>
           <w:sz w:val="32"/>
@@ -1753,7 +1713,6 @@
         <w:t xml:space="preserve"> </w:t>
       </w:r>
       <w:proofErr w:type="spellStart"/>
-      <w:proofErr w:type="gramStart"/>
       <w:r>
         <w:rPr>
           <w:b/>
@@ -1764,7 +1723,6 @@
         <w:t>main.dart</w:t>
       </w:r>
       <w:proofErr w:type="spellEnd"/>
-      <w:proofErr w:type="gramEnd"/>
       <w:r>
         <w:rPr>
           <w:sz w:val="32"/>
@@ -2030,20 +1988,8 @@
           <w:sz w:val="32"/>
           <w:szCs w:val="32"/>
         </w:rPr>
-        <w:t xml:space="preserve">flutter </w:t>
-      </w:r>
-      <w:proofErr w:type="gramStart"/>
-      <w:r>
-        <w:rPr>
-          <w:b/>
-          <w:bCs/>
-          <w:color w:val="60CAF3" w:themeColor="accent4" w:themeTint="99"/>
-          <w:sz w:val="32"/>
-          <w:szCs w:val="32"/>
-        </w:rPr>
-        <w:t>analyze</w:t>
-      </w:r>
-      <w:proofErr w:type="gramEnd"/>
+        <w:t>flutter analyze</w:t>
+      </w:r>
     </w:p>
     <w:p>
       <w:pPr>
@@ -2089,20 +2035,8 @@
           <w:sz w:val="32"/>
           <w:szCs w:val="32"/>
         </w:rPr>
-        <w:t xml:space="preserve">dart </w:t>
-      </w:r>
-      <w:proofErr w:type="gramStart"/>
-      <w:r>
-        <w:rPr>
-          <w:b/>
-          <w:bCs/>
-          <w:color w:val="60CAF3" w:themeColor="accent4" w:themeTint="99"/>
-          <w:sz w:val="32"/>
-          <w:szCs w:val="32"/>
-        </w:rPr>
-        <w:t>format .</w:t>
-      </w:r>
-      <w:proofErr w:type="gramEnd"/>
+        <w:t>dart format .</w:t>
+      </w:r>
     </w:p>
     <w:p>
       <w:pPr>
@@ -2275,7 +2209,28 @@
           <w:sz w:val="32"/>
           <w:szCs w:val="32"/>
         </w:rPr>
-        <w:t>Run one test</w:t>
+        <w:t>Run one</w:t>
+      </w:r>
+      <w:r>
+        <w:rPr>
+          <w:sz w:val="32"/>
+          <w:szCs w:val="32"/>
+        </w:rPr>
+        <w:t xml:space="preserve"> specific</w:t>
+      </w:r>
+      <w:r>
+        <w:rPr>
+          <w:sz w:val="32"/>
+          <w:szCs w:val="32"/>
+        </w:rPr>
+        <w:t xml:space="preserve"> test</w:t>
+      </w:r>
+      <w:r>
+        <w:rPr>
+          <w:sz w:val="32"/>
+          <w:szCs w:val="32"/>
+        </w:rPr>
+        <w:t xml:space="preserve"> file</w:t>
       </w:r>
     </w:p>
     <w:p>
@@ -2299,6 +2254,16 @@
         </w:rPr>
         <w:t>flutter test test/</w:t>
       </w:r>
+      <w:r>
+        <w:rPr>
+          <w:b/>
+          <w:bCs/>
+          <w:color w:val="60CAF3" w:themeColor="accent4" w:themeTint="99"/>
+          <w:sz w:val="32"/>
+          <w:szCs w:val="32"/>
+        </w:rPr>
+        <w:t>screens/</w:t>
+      </w:r>
       <w:proofErr w:type="spellStart"/>
       <w:r>
         <w:rPr>
@@ -2332,8 +2297,22 @@
           <w:sz w:val="32"/>
           <w:szCs w:val="32"/>
         </w:rPr>
+        <w:t xml:space="preserve">Run tests with </w:t>
+      </w:r>
+      <w:r>
+        <w:rPr>
+          <w:sz w:val="32"/>
+          <w:szCs w:val="32"/>
+        </w:rPr>
         <w:t>Coverage</w:t>
       </w:r>
+      <w:r>
+        <w:rPr>
+          <w:sz w:val="32"/>
+          <w:szCs w:val="32"/>
+        </w:rPr>
+        <w:t xml:space="preserve"> report</w:t>
+      </w:r>
     </w:p>
     <w:p>
       <w:pPr>
@@ -2355,6 +2334,54 @@
           <w:szCs w:val="32"/>
         </w:rPr>
         <w:t>flutter test --coverage</w:t>
+      </w:r>
+    </w:p>
+    <w:p>
+      <w:pPr>
+        <w:jc w:val="both"/>
+        <w:rPr>
+          <w:sz w:val="32"/>
+          <w:szCs w:val="32"/>
+        </w:rPr>
+      </w:pPr>
+      <w:r>
+        <w:rPr>
+          <w:sz w:val="32"/>
+          <w:szCs w:val="32"/>
+        </w:rPr>
+        <w:t># Run tests matching a name pattern</w:t>
+      </w:r>
+    </w:p>
+    <w:p>
+      <w:pPr>
+        <w:jc w:val="both"/>
+        <w:rPr>
+          <w:b/>
+          <w:bCs/>
+          <w:color w:val="60CAF3" w:themeColor="accent4" w:themeTint="99"/>
+          <w:sz w:val="32"/>
+          <w:szCs w:val="32"/>
+        </w:rPr>
+      </w:pPr>
+      <w:r>
+        <w:rPr>
+          <w:b/>
+          <w:bCs/>
+          <w:color w:val="60CAF3" w:themeColor="accent4" w:themeTint="99"/>
+          <w:sz w:val="32"/>
+          <w:szCs w:val="32"/>
+        </w:rPr>
+        <w:t xml:space="preserve">flutter test --name </w:t>
+      </w:r>
+      <w:r>
+        <w:rPr>
+          <w:b/>
+          <w:bCs/>
+          <w:color w:val="60CAF3" w:themeColor="accent4" w:themeTint="99"/>
+          <w:sz w:val="32"/>
+          <w:szCs w:val="32"/>
+        </w:rPr>
+        <w:t>"adds a song"</w:t>
       </w:r>
     </w:p>
     <w:p>
@@ -2436,6 +2463,7 @@
           <w:sz w:val="32"/>
           <w:szCs w:val="32"/>
         </w:rPr>
+        <w:lastRenderedPageBreak/>
         <w:t>flutter doctor</w:t>
       </w:r>
     </w:p>
@@ -2481,7 +2509,6 @@
           <w:sz w:val="32"/>
           <w:szCs w:val="32"/>
         </w:rPr>
-        <w:lastRenderedPageBreak/>
         <w:t>flutter doctor -v</w:t>
       </w:r>
     </w:p>
@@ -2854,20 +2881,8 @@
           <w:sz w:val="32"/>
           <w:szCs w:val="32"/>
         </w:rPr>
-        <w:t xml:space="preserve">flutter pub </w:t>
-      </w:r>
-      <w:proofErr w:type="gramStart"/>
-      <w:r>
-        <w:rPr>
-          <w:b/>
-          <w:bCs/>
-          <w:color w:val="60CAF3" w:themeColor="accent4" w:themeTint="99"/>
-          <w:sz w:val="32"/>
-          <w:szCs w:val="32"/>
-        </w:rPr>
-        <w:t>get</w:t>
-      </w:r>
-      <w:proofErr w:type="gramEnd"/>
+        <w:t>flutter pub get</w:t>
+      </w:r>
     </w:p>
     <w:p>
       <w:pPr>
@@ -2971,6 +2986,7 @@
           <w:sz w:val="32"/>
           <w:szCs w:val="32"/>
         </w:rPr>
+        <w:lastRenderedPageBreak/>
         <w:t xml:space="preserve"># </w:t>
       </w:r>
       <w:r>
@@ -3524,6 +3540,7 @@
           <w:sz w:val="32"/>
           <w:szCs w:val="32"/>
         </w:rPr>
+        <w:lastRenderedPageBreak/>
         <w:t>dart run build_runner watch</w:t>
       </w:r>
     </w:p>
@@ -3566,7 +3583,6 @@
           <w:sz w:val="32"/>
           <w:szCs w:val="32"/>
         </w:rPr>
-        <w:lastRenderedPageBreak/>
         <w:t>dart run build_runner build --delete-conflicting-outputs</w:t>
       </w:r>
     </w:p>
@@ -3884,7 +3900,15 @@
           <w:sz w:val="32"/>
           <w:szCs w:val="32"/>
         </w:rPr>
-        <w:t>and click on internet protocol version 4 TCP.</w:t>
+        <w:t xml:space="preserve">and click on internet protocol </w:t>
+      </w:r>
+      <w:r>
+        <w:rPr>
+          <w:sz w:val="32"/>
+          <w:szCs w:val="32"/>
+        </w:rPr>
+        <w:lastRenderedPageBreak/>
+        <w:t>version 4 TCP.</w:t>
       </w:r>
       <w:r>
         <w:rPr>
@@ -3900,13 +3924,6 @@
           <w:szCs w:val="32"/>
         </w:rPr>
         <w:br/>
-      </w:r>
-      <w:r>
-        <w:rPr>
-          <w:sz w:val="32"/>
-          <w:szCs w:val="32"/>
-        </w:rPr>
-        <w:lastRenderedPageBreak/>
         <w:t xml:space="preserve">5. Set DNS </w:t>
       </w:r>
       <w:hyperlink r:id="rId7" w:tgtFrame="_self" w:history="1">
@@ -3993,21 +4010,12 @@
         <w:t>="</w:t>
       </w:r>
       <w:proofErr w:type="spellStart"/>
-      <w:proofErr w:type="gramStart"/>
-      <w:r>
-        <w:rPr>
-          <w:sz w:val="32"/>
-          <w:szCs w:val="32"/>
-        </w:rPr>
-        <w:t>android.permission</w:t>
-      </w:r>
-      <w:proofErr w:type="gramEnd"/>
-      <w:r>
-        <w:rPr>
-          <w:sz w:val="32"/>
-          <w:szCs w:val="32"/>
-        </w:rPr>
-        <w:t>.INTERNET</w:t>
+      <w:r>
+        <w:rPr>
+          <w:sz w:val="32"/>
+          <w:szCs w:val="32"/>
+        </w:rPr>
+        <w:t>android.permission.INTERNET</w:t>
       </w:r>
       <w:proofErr w:type="spellEnd"/>
       <w:r>
@@ -4077,7 +4085,6 @@
         <w:t xml:space="preserve"> not connected just open it and click on the </w:t>
       </w:r>
       <w:proofErr w:type="spellStart"/>
-      <w:proofErr w:type="gramStart"/>
       <w:r>
         <w:rPr>
           <w:sz w:val="32"/>
@@ -4086,7 +4093,6 @@
         <w:t>settings.gradle</w:t>
       </w:r>
       <w:proofErr w:type="spellEnd"/>
-      <w:proofErr w:type="gramEnd"/>
       <w:r>
         <w:rPr>
           <w:sz w:val="32"/>
@@ -4124,23 +4130,7 @@
           <w:sz w:val="32"/>
           <w:szCs w:val="32"/>
         </w:rPr>
-        <w:t xml:space="preserve"> just </w:t>
-      </w:r>
-      <w:proofErr w:type="gramStart"/>
-      <w:r>
-        <w:rPr>
-          <w:sz w:val="32"/>
-          <w:szCs w:val="32"/>
-        </w:rPr>
-        <w:t>delete .idea</w:t>
-      </w:r>
-      <w:proofErr w:type="gramEnd"/>
-      <w:r>
-        <w:rPr>
-          <w:sz w:val="32"/>
-          <w:szCs w:val="32"/>
-        </w:rPr>
-        <w:t xml:space="preserve"> in project file and in c drive user delete .</w:t>
+        <w:t xml:space="preserve"> just delete .idea in project file and in c drive user delete .</w:t>
       </w:r>
       <w:proofErr w:type="spellStart"/>
       <w:r>
@@ -4341,6 +4331,7 @@
           <w:sz w:val="32"/>
           <w:szCs w:val="32"/>
         </w:rPr>
+        <w:lastRenderedPageBreak/>
         <w:t>Flutter and dart upgrade:</w:t>
       </w:r>
     </w:p>
@@ -4373,7 +4364,6 @@
           <w:sz w:val="32"/>
           <w:szCs w:val="32"/>
         </w:rPr>
-        <w:lastRenderedPageBreak/>
         <w:t xml:space="preserve">flutter upgrade in administrator mode in </w:t>
       </w:r>
       <w:proofErr w:type="spellStart"/>
@@ -4523,7 +4513,6 @@
         <w:t xml:space="preserve">3. Adjust the dependencies and plug-ins in </w:t>
       </w:r>
       <w:proofErr w:type="spellStart"/>
-      <w:proofErr w:type="gramStart"/>
       <w:r>
         <w:rPr>
           <w:sz w:val="32"/>
@@ -4532,7 +4521,6 @@
         <w:t>build.gradle</w:t>
       </w:r>
       <w:proofErr w:type="spellEnd"/>
-      <w:proofErr w:type="gramEnd"/>
       <w:r>
         <w:rPr>
           <w:sz w:val="32"/>
@@ -4620,7 +4608,6 @@
         <w:t xml:space="preserve"> in </w:t>
       </w:r>
       <w:proofErr w:type="spellStart"/>
-      <w:proofErr w:type="gramStart"/>
       <w:r>
         <w:rPr>
           <w:sz w:val="32"/>
@@ -4629,7 +4616,6 @@
         <w:t>main.dart</w:t>
       </w:r>
       <w:proofErr w:type="spellEnd"/>
-      <w:proofErr w:type="gramEnd"/>
       <w:r>
         <w:rPr>
           <w:sz w:val="32"/>
@@ -4697,6 +4683,13 @@
           <w:szCs w:val="32"/>
         </w:rPr>
         <w:br/>
+      </w:r>
+      <w:r>
+        <w:rPr>
+          <w:sz w:val="32"/>
+          <w:szCs w:val="32"/>
+        </w:rPr>
+        <w:lastRenderedPageBreak/>
         <w:t xml:space="preserve">6. You might find issues with </w:t>
       </w:r>
       <w:proofErr w:type="spellStart"/>
@@ -4732,7 +4725,6 @@
         <w:t xml:space="preserve"> adjust them in the </w:t>
       </w:r>
       <w:proofErr w:type="spellStart"/>
-      <w:proofErr w:type="gramStart"/>
       <w:r>
         <w:rPr>
           <w:sz w:val="32"/>
@@ -4741,7 +4733,6 @@
         <w:t>build.gradle</w:t>
       </w:r>
       <w:proofErr w:type="spellEnd"/>
-      <w:proofErr w:type="gramEnd"/>
       <w:r>
         <w:rPr>
           <w:sz w:val="32"/>
@@ -4763,15 +4754,7 @@
           <w:sz w:val="32"/>
           <w:szCs w:val="32"/>
         </w:rPr>
-        <w:t xml:space="preserve"> tools and get the </w:t>
-      </w:r>
-      <w:r>
-        <w:rPr>
-          <w:sz w:val="32"/>
-          <w:szCs w:val="32"/>
-        </w:rPr>
-        <w:lastRenderedPageBreak/>
-        <w:t xml:space="preserve">desired </w:t>
+        <w:t xml:space="preserve"> tools and get the desired </w:t>
       </w:r>
       <w:proofErr w:type="spellStart"/>
       <w:r>
@@ -4837,7 +4820,6 @@
         <w:t xml:space="preserve"> not connected just open it and click on the </w:t>
       </w:r>
       <w:proofErr w:type="spellStart"/>
-      <w:proofErr w:type="gramStart"/>
       <w:r>
         <w:rPr>
           <w:sz w:val="32"/>
@@ -4846,7 +4828,6 @@
         <w:t>settings.gradle</w:t>
       </w:r>
       <w:proofErr w:type="spellEnd"/>
-      <w:proofErr w:type="gramEnd"/>
       <w:r>
         <w:rPr>
           <w:sz w:val="32"/>
@@ -4953,7 +4934,6 @@
         <w:t xml:space="preserve"> not connected just open it and click on the </w:t>
       </w:r>
       <w:proofErr w:type="spellStart"/>
-      <w:proofErr w:type="gramStart"/>
       <w:r>
         <w:rPr>
           <w:sz w:val="32"/>
@@ -4962,7 +4942,6 @@
         <w:t>settings.gradle</w:t>
       </w:r>
       <w:proofErr w:type="spellEnd"/>
-      <w:proofErr w:type="gramEnd"/>
       <w:r>
         <w:rPr>
           <w:sz w:val="32"/>
@@ -5224,6 +5203,7 @@
           <w:sz w:val="32"/>
           <w:szCs w:val="32"/>
         </w:rPr>
+        <w:lastRenderedPageBreak/>
         <w:t>it simply fetches the emulator’s mock location, not our device’s.</w:t>
       </w:r>
       <w:r>
@@ -5525,7 +5505,6 @@
         <w:t xml:space="preserve">After this, when you rerun your app, </w:t>
       </w:r>
       <w:proofErr w:type="spellStart"/>
-      <w:proofErr w:type="gramStart"/>
       <w:r>
         <w:rPr>
           <w:b/>
@@ -5543,17 +5522,7 @@
           <w:sz w:val="32"/>
           <w:szCs w:val="32"/>
         </w:rPr>
-        <w:t>(</w:t>
-      </w:r>
-      <w:proofErr w:type="gramEnd"/>
-      <w:r>
-        <w:rPr>
-          <w:b/>
-          <w:bCs/>
-          <w:sz w:val="32"/>
-          <w:szCs w:val="32"/>
-        </w:rPr>
-        <w:t>)</w:t>
+        <w:t>()</w:t>
       </w:r>
       <w:r>
         <w:rPr>
@@ -5866,7 +5835,6 @@
         <w:tab/>
       </w:r>
       <w:proofErr w:type="spellStart"/>
-      <w:proofErr w:type="gramStart"/>
       <w:r>
         <w:rPr>
           <w:b/>
@@ -5878,7 +5846,6 @@
         <w:t>android:allowBackup</w:t>
       </w:r>
       <w:proofErr w:type="spellEnd"/>
-      <w:proofErr w:type="gramEnd"/>
       <w:r>
         <w:rPr>
           <w:b/>
@@ -5919,10 +5886,10 @@
           <w:sz w:val="32"/>
           <w:szCs w:val="32"/>
         </w:rPr>
+        <w:lastRenderedPageBreak/>
         <w:tab/>
       </w:r>
       <w:proofErr w:type="spellStart"/>
-      <w:proofErr w:type="gramStart"/>
       <w:r>
         <w:rPr>
           <w:b/>
@@ -5944,7 +5911,6 @@
         <w:t>Content</w:t>
       </w:r>
       <w:proofErr w:type="spellEnd"/>
-      <w:proofErr w:type="gramEnd"/>
       <w:r>
         <w:rPr>
           <w:b/>
@@ -6008,7 +5974,6 @@
           <w:sz w:val="32"/>
           <w:szCs w:val="32"/>
         </w:rPr>
-        <w:lastRenderedPageBreak/>
         <w:t>&lt;/application&gt;</w:t>
       </w:r>
     </w:p>
@@ -6165,27 +6130,15 @@
         </w:rPr>
       </w:pPr>
       <w:proofErr w:type="spellStart"/>
-      <w:proofErr w:type="gramStart"/>
-      <w:r>
-        <w:rPr>
-          <w:b/>
-          <w:bCs/>
-          <w:color w:val="60CAF3" w:themeColor="accent4" w:themeTint="99"/>
-          <w:sz w:val="32"/>
-          <w:szCs w:val="32"/>
-        </w:rPr>
-        <w:t>com.spotify</w:t>
-      </w:r>
-      <w:proofErr w:type="gramEnd"/>
-      <w:r>
-        <w:rPr>
-          <w:b/>
-          <w:bCs/>
-          <w:color w:val="60CAF3" w:themeColor="accent4" w:themeTint="99"/>
-          <w:sz w:val="32"/>
-          <w:szCs w:val="32"/>
-        </w:rPr>
-        <w:t>.music</w:t>
+      <w:r>
+        <w:rPr>
+          <w:b/>
+          <w:bCs/>
+          <w:color w:val="60CAF3" w:themeColor="accent4" w:themeTint="99"/>
+          <w:sz w:val="32"/>
+          <w:szCs w:val="32"/>
+        </w:rPr>
+        <w:t>com.spotify.music</w:t>
       </w:r>
       <w:proofErr w:type="spellEnd"/>
     </w:p>
@@ -6206,7 +6159,6 @@
         </w:rPr>
       </w:pPr>
       <w:proofErr w:type="spellStart"/>
-      <w:proofErr w:type="gramStart"/>
       <w:r>
         <w:rPr>
           <w:b/>
@@ -6218,7 +6170,6 @@
         <w:t>com.whatsapp</w:t>
       </w:r>
       <w:proofErr w:type="spellEnd"/>
-      <w:proofErr w:type="gramEnd"/>
     </w:p>
     <w:p>
       <w:pPr>
@@ -6237,27 +6188,15 @@
         </w:rPr>
       </w:pPr>
       <w:proofErr w:type="spellStart"/>
-      <w:proofErr w:type="gramStart"/>
-      <w:r>
-        <w:rPr>
-          <w:b/>
-          <w:bCs/>
-          <w:color w:val="60CAF3" w:themeColor="accent4" w:themeTint="99"/>
-          <w:sz w:val="32"/>
-          <w:szCs w:val="32"/>
-        </w:rPr>
-        <w:t>com.yourname</w:t>
-      </w:r>
-      <w:proofErr w:type="gramEnd"/>
-      <w:r>
-        <w:rPr>
-          <w:b/>
-          <w:bCs/>
-          <w:color w:val="60CAF3" w:themeColor="accent4" w:themeTint="99"/>
-          <w:sz w:val="32"/>
-          <w:szCs w:val="32"/>
-        </w:rPr>
-        <w:t>.myapp</w:t>
+      <w:r>
+        <w:rPr>
+          <w:b/>
+          <w:bCs/>
+          <w:color w:val="60CAF3" w:themeColor="accent4" w:themeTint="99"/>
+          <w:sz w:val="32"/>
+          <w:szCs w:val="32"/>
+        </w:rPr>
+        <w:t>com.yourname.myapp</w:t>
       </w:r>
       <w:proofErr w:type="spellEnd"/>
     </w:p>
@@ -6345,19 +6284,8 @@
           <w:sz w:val="32"/>
           <w:szCs w:val="32"/>
         </w:rPr>
-        <w:t>com.</w:t>
-      </w:r>
-      <w:proofErr w:type="gramStart"/>
-      <w:r>
-        <w:rPr>
-          <w:b/>
-          <w:bCs/>
-          <w:sz w:val="32"/>
-          <w:szCs w:val="32"/>
-        </w:rPr>
-        <w:t>example.*</w:t>
-      </w:r>
-      <w:proofErr w:type="gramEnd"/>
+        <w:t>com.example.*</w:t>
+      </w:r>
       <w:r>
         <w:rPr>
           <w:sz w:val="32"/>
@@ -6470,7 +6398,6 @@
         <w:t>your_domain_or_name</w:t>
       </w:r>
       <w:proofErr w:type="spellEnd"/>
-      <w:proofErr w:type="gramStart"/>
       <w:r>
         <w:rPr>
           <w:b/>
@@ -6481,7 +6408,6 @@
         <w:t>&gt;.&lt;</w:t>
       </w:r>
       <w:proofErr w:type="spellStart"/>
-      <w:proofErr w:type="gramEnd"/>
       <w:r>
         <w:rPr>
           <w:b/>
@@ -6550,27 +6476,15 @@
         <w:t xml:space="preserve"> = "</w:t>
       </w:r>
       <w:proofErr w:type="spellStart"/>
-      <w:proofErr w:type="gramStart"/>
-      <w:r>
-        <w:rPr>
-          <w:b/>
-          <w:bCs/>
-          <w:color w:val="60CAF3" w:themeColor="accent4" w:themeTint="99"/>
-          <w:sz w:val="32"/>
-          <w:szCs w:val="32"/>
-        </w:rPr>
-        <w:t>com.nazmul</w:t>
-      </w:r>
-      <w:proofErr w:type="gramEnd"/>
-      <w:r>
-        <w:rPr>
-          <w:b/>
-          <w:bCs/>
-          <w:color w:val="60CAF3" w:themeColor="accent4" w:themeTint="99"/>
-          <w:sz w:val="32"/>
-          <w:szCs w:val="32"/>
-        </w:rPr>
-        <w:t>.musicplayer</w:t>
+      <w:r>
+        <w:rPr>
+          <w:b/>
+          <w:bCs/>
+          <w:color w:val="60CAF3" w:themeColor="accent4" w:themeTint="99"/>
+          <w:sz w:val="32"/>
+          <w:szCs w:val="32"/>
+        </w:rPr>
+        <w:t>com.nazmul.musicplayer</w:t>
       </w:r>
       <w:proofErr w:type="spellEnd"/>
       <w:r>
@@ -6646,6 +6560,7 @@
           <w:sz w:val="32"/>
           <w:szCs w:val="32"/>
         </w:rPr>
+        <w:lastRenderedPageBreak/>
         <w:t>No spaces</w:t>
       </w:r>
     </w:p>
@@ -7034,29 +6949,7 @@
           <w:sz w:val="32"/>
           <w:szCs w:val="32"/>
         </w:rPr>
-        <w:t xml:space="preserve"> Android App: com.</w:t>
-      </w:r>
-      <w:proofErr w:type="gramStart"/>
-      <w:r>
-        <w:rPr>
-          <w:b/>
-          <w:bCs/>
-          <w:color w:val="60CAF3" w:themeColor="accent4" w:themeTint="99"/>
-          <w:sz w:val="32"/>
-          <w:szCs w:val="32"/>
-        </w:rPr>
-        <w:t>example.of</w:t>
-      </w:r>
-      <w:proofErr w:type="gramEnd"/>
-      <w:r>
-        <w:rPr>
-          <w:b/>
-          <w:bCs/>
-          <w:color w:val="60CAF3" w:themeColor="accent4" w:themeTint="99"/>
-          <w:sz w:val="32"/>
-          <w:szCs w:val="32"/>
-        </w:rPr>
-        <w:t>11_music_app</w:t>
+        <w:t xml:space="preserve"> Android App: com.example.of11_music_app</w:t>
       </w:r>
     </w:p>
     <w:p>
@@ -7081,27 +6974,15 @@
         <w:t xml:space="preserve"> └─ Android App: </w:t>
       </w:r>
       <w:proofErr w:type="spellStart"/>
-      <w:proofErr w:type="gramStart"/>
-      <w:r>
-        <w:rPr>
-          <w:b/>
-          <w:bCs/>
-          <w:color w:val="60CAF3" w:themeColor="accent4" w:themeTint="99"/>
-          <w:sz w:val="32"/>
-          <w:szCs w:val="32"/>
-        </w:rPr>
-        <w:t>com.nazmul</w:t>
-      </w:r>
-      <w:proofErr w:type="gramEnd"/>
-      <w:r>
-        <w:rPr>
-          <w:b/>
-          <w:bCs/>
-          <w:color w:val="60CAF3" w:themeColor="accent4" w:themeTint="99"/>
-          <w:sz w:val="32"/>
-          <w:szCs w:val="32"/>
-        </w:rPr>
-        <w:t>.musicplayer</w:t>
+      <w:r>
+        <w:rPr>
+          <w:b/>
+          <w:bCs/>
+          <w:color w:val="60CAF3" w:themeColor="accent4" w:themeTint="99"/>
+          <w:sz w:val="32"/>
+          <w:szCs w:val="32"/>
+        </w:rPr>
+        <w:t>com.nazmul.musicplayer</w:t>
       </w:r>
       <w:proofErr w:type="spellEnd"/>
     </w:p>
@@ -7261,23 +7142,30 @@
           <w:sz w:val="32"/>
           <w:szCs w:val="32"/>
         </w:rPr>
-        <w:t xml:space="preserve"> means auto-generated files, created &amp; managed by Flutter tooling and can be deleted and regenerated anytime. Flutter is saying: “In the future, we want to move more stuff into ephemeral files.”</w:t>
-      </w:r>
-    </w:p>
-    <w:p>
-      <w:pPr>
-        <w:jc w:val="both"/>
-        <w:rPr>
-          <w:sz w:val="32"/>
-          <w:szCs w:val="32"/>
-        </w:rPr>
-      </w:pPr>
+        <w:t xml:space="preserve"> means auto-generated files, created &amp; managed by Flutter tooling and can be deleted and regenerated </w:t>
+      </w:r>
       <w:r>
         <w:rPr>
           <w:sz w:val="32"/>
           <w:szCs w:val="32"/>
         </w:rPr>
         <w:lastRenderedPageBreak/>
+        <w:t>anytime. Flutter is saying: “In the future, we want to move more stuff into ephemeral files.”</w:t>
+      </w:r>
+    </w:p>
+    <w:p>
+      <w:pPr>
+        <w:jc w:val="both"/>
+        <w:rPr>
+          <w:sz w:val="32"/>
+          <w:szCs w:val="32"/>
+        </w:rPr>
+      </w:pPr>
+      <w:r>
+        <w:rPr>
+          <w:sz w:val="32"/>
+          <w:szCs w:val="32"/>
+        </w:rPr>
         <w:t># We shouldn’t do anything for this</w:t>
       </w:r>
       <w:r>

</xml_diff>